<commit_message>
Fix FR.250 signature requirements
</commit_message>
<xml_diff>
--- a/backend/uaf_blank_set/9-14-45-22-5001/Transfer/FR.250_Transfer_Application_Control_Form_R3&17.07.2026.docx
+++ b/backend/uaf_blank_set/9-14-45-22-5001/Transfer/FR.250_Transfer_Application_Control_Form_R3&17.07.2026.docx
@@ -11601,6 +11601,9 @@
               <w:jc w:val="center"/>
             </w:pPr>
             <w:r>
+              <w:rPr>
+                <w:color w:val="FFFFFF"/>
+              </w:rPr>
               <w:t>[SIG:CB_PLANNER]</w:t>
             </w:r>
           </w:p>
@@ -11755,578 +11758,10 @@
               <w:jc w:val="center"/>
             </w:pPr>
             <w:r>
+              <w:rPr>
+                <w:color w:val="FFFFFF"/>
+              </w:rPr>
               <w:t>[SIG:TRANSFER_REVIEWER]</w:t>
-            </w:r>
-          </w:p>
-        </w:tc>
-      </w:tr>
-      <w:tr>
-        <w:trPr>
-          <w:trHeight w:val="1260" w:hRule="atLeast"/>
-        </w:trPr>
-        <w:tc>
-          <w:tcPr>
-            <w:tcW w:w="1668" w:type="dxa"/>
-          </w:tcPr>
-          <w:p>
-            <w:pPr>
-              <w:pStyle w:val="TableParagraph"/>
-              <w:spacing w:line="261" w:lineRule="auto" w:before="56"/>
-              <w:ind w:right="349"/>
-              <w:rPr>
-                <w:b/>
-                <w:sz w:val="16"/>
-              </w:rPr>
-            </w:pPr>
-            <w:r>
-              <w:rPr>
-                <w:b/>
-                <w:spacing w:val="-2"/>
-                <w:sz w:val="16"/>
-              </w:rPr>
-              <w:t>Certification</w:t>
-            </w:r>
-            <w:r>
-              <w:rPr>
-                <w:b/>
-                <w:spacing w:val="40"/>
-                <w:sz w:val="16"/>
-              </w:rPr>
-              <w:t> </w:t>
-            </w:r>
-            <w:r>
-              <w:rPr>
-                <w:b/>
-                <w:spacing w:val="-2"/>
-                <w:sz w:val="16"/>
-              </w:rPr>
-              <w:t>Decision</w:t>
-            </w:r>
-          </w:p>
-          <w:p>
-            <w:pPr>
-              <w:pStyle w:val="TableParagraph"/>
-              <w:spacing w:before="65"/>
-              <w:rPr>
-                <w:i/>
-                <w:sz w:val="12"/>
-              </w:rPr>
-            </w:pPr>
-            <w:r>
-              <w:rPr>
-                <w:i/>
-                <w:sz w:val="12"/>
-              </w:rPr>
-              <w:t>IAF</w:t>
-            </w:r>
-            <w:r>
-              <w:rPr>
-                <w:i/>
-                <w:spacing w:val="-3"/>
-                <w:sz w:val="12"/>
-              </w:rPr>
-              <w:t> </w:t>
-            </w:r>
-            <w:r>
-              <w:rPr>
-                <w:i/>
-                <w:sz w:val="12"/>
-              </w:rPr>
-              <w:t>MD</w:t>
-            </w:r>
-            <w:r>
-              <w:rPr>
-                <w:i/>
-                <w:spacing w:val="-2"/>
-                <w:sz w:val="12"/>
-              </w:rPr>
-              <w:t> 2:2023</w:t>
-            </w:r>
-          </w:p>
-          <w:p>
-            <w:pPr>
-              <w:pStyle w:val="TableParagraph"/>
-              <w:spacing w:before="62"/>
-              <w:rPr>
-                <w:i/>
-                <w:sz w:val="12"/>
-              </w:rPr>
-            </w:pPr>
-            <w:r>
-              <w:rPr>
-                <w:i/>
-                <w:sz w:val="12"/>
-              </w:rPr>
-              <w:t>Cl. </w:t>
-            </w:r>
-            <w:r>
-              <w:rPr>
-                <w:i/>
-                <w:spacing w:val="-2"/>
-                <w:sz w:val="12"/>
-              </w:rPr>
-              <w:t>2.3.3</w:t>
-            </w:r>
-          </w:p>
-          <w:p>
-            <w:pPr>
-              <w:pStyle w:val="TableParagraph"/>
-              <w:spacing w:before="62"/>
-              <w:rPr>
-                <w:i/>
-                <w:sz w:val="12"/>
-              </w:rPr>
-            </w:pPr>
-            <w:r>
-              <w:rPr>
-                <w:i/>
-                <w:sz w:val="12"/>
-              </w:rPr>
-              <w:t>ISO/IEC</w:t>
-            </w:r>
-            <w:r>
-              <w:rPr>
-                <w:i/>
-                <w:spacing w:val="-7"/>
-                <w:sz w:val="12"/>
-              </w:rPr>
-              <w:t> </w:t>
-            </w:r>
-            <w:r>
-              <w:rPr>
-                <w:i/>
-                <w:sz w:val="12"/>
-              </w:rPr>
-              <w:t>17021-</w:t>
-            </w:r>
-            <w:r>
-              <w:rPr>
-                <w:i/>
-                <w:spacing w:val="-10"/>
-                <w:sz w:val="12"/>
-              </w:rPr>
-              <w:t>1</w:t>
-            </w:r>
-          </w:p>
-          <w:p>
-            <w:pPr>
-              <w:pStyle w:val="TableParagraph"/>
-              <w:spacing w:line="118" w:lineRule="exact" w:before="62"/>
-              <w:rPr>
-                <w:i/>
-                <w:sz w:val="12"/>
-              </w:rPr>
-            </w:pPr>
-            <w:r>
-              <w:rPr>
-                <w:i/>
-                <w:sz w:val="12"/>
-              </w:rPr>
-              <w:t>Cl. </w:t>
-            </w:r>
-            <w:r>
-              <w:rPr>
-                <w:i/>
-                <w:spacing w:val="-5"/>
-                <w:sz w:val="12"/>
-              </w:rPr>
-              <w:t>9.5</w:t>
-            </w:r>
-          </w:p>
-        </w:tc>
-        <w:tc>
-          <w:tcPr>
-            <w:tcW w:w="3838" w:type="dxa"/>
-          </w:tcPr>
-          <w:p>
-            <w:pPr>
-              <w:pStyle w:val="TableParagraph"/>
-              <w:ind w:left="0"/>
-              <w:rPr>
-                <w:sz w:val="14"/>
-              </w:rPr>
-            </w:pPr>
-          </w:p>
-        </w:tc>
-        <w:tc>
-          <w:tcPr>
-            <w:tcW w:w="1510" w:type="dxa"/>
-            <w:gridSpan w:val="2"/>
-          </w:tcPr>
-          <w:p>
-            <w:pPr>
-              <w:pStyle w:val="TableParagraph"/>
-              <w:ind w:left="0"/>
-              <w:rPr>
-                <w:sz w:val="14"/>
-              </w:rPr>
-            </w:pPr>
-          </w:p>
-        </w:tc>
-        <w:tc>
-          <w:tcPr>
-            <w:tcW w:w="3484" w:type="dxa"/>
-            <w:gridSpan w:val="2"/>
-            <w:vAlign w:val="center"/>
-          </w:tcPr>
-          <w:p>
-            <w:pPr>
-              <w:jc w:val="center"/>
-            </w:pPr>
-            <w:r>
-              <w:t>[SIG:TRANSFER_CERT_DECISION]</w:t>
-            </w:r>
-          </w:p>
-        </w:tc>
-      </w:tr>
-      <w:tr>
-        <w:trPr>
-          <w:trHeight w:val="240" w:hRule="atLeast"/>
-        </w:trPr>
-        <w:tc>
-          <w:tcPr>
-            <w:tcW w:w="10500" w:type="dxa"/>
-            <w:gridSpan w:val="6"/>
-          </w:tcPr>
-          <w:p>
-            <w:pPr>
-              <w:pStyle w:val="TableParagraph"/>
-              <w:spacing w:line="141" w:lineRule="exact" w:before="79"/>
-              <w:ind w:left="105"/>
-              <w:rPr>
-                <w:i/>
-                <w:sz w:val="14"/>
-              </w:rPr>
-            </w:pPr>
-            <w:r>
-              <w:rPr>
-                <w:i/>
-                <w:sz w:val="14"/>
-              </w:rPr>
-              <w:t>The</w:t>
-            </w:r>
-            <w:r>
-              <w:rPr>
-                <w:i/>
-                <w:spacing w:val="-6"/>
-                <w:sz w:val="14"/>
-              </w:rPr>
-              <w:t> </w:t>
-            </w:r>
-            <w:r>
-              <w:rPr>
-                <w:i/>
-                <w:sz w:val="14"/>
-              </w:rPr>
-              <w:t>person</w:t>
-            </w:r>
-            <w:r>
-              <w:rPr>
-                <w:i/>
-                <w:spacing w:val="-2"/>
-                <w:sz w:val="14"/>
-              </w:rPr>
-              <w:t> </w:t>
-            </w:r>
-            <w:r>
-              <w:rPr>
-                <w:i/>
-                <w:sz w:val="14"/>
-              </w:rPr>
-              <w:t>taking</w:t>
-            </w:r>
-            <w:r>
-              <w:rPr>
-                <w:i/>
-                <w:spacing w:val="-2"/>
-                <w:sz w:val="14"/>
-              </w:rPr>
-              <w:t> </w:t>
-            </w:r>
-            <w:r>
-              <w:rPr>
-                <w:i/>
-                <w:sz w:val="14"/>
-              </w:rPr>
-              <w:t>the</w:t>
-            </w:r>
-            <w:r>
-              <w:rPr>
-                <w:i/>
-                <w:spacing w:val="-4"/>
-                <w:sz w:val="14"/>
-              </w:rPr>
-              <w:t> </w:t>
-            </w:r>
-            <w:r>
-              <w:rPr>
-                <w:i/>
-                <w:sz w:val="14"/>
-              </w:rPr>
-              <w:t>certification</w:t>
-            </w:r>
-            <w:r>
-              <w:rPr>
-                <w:i/>
-                <w:spacing w:val="-2"/>
-                <w:sz w:val="14"/>
-              </w:rPr>
-              <w:t> </w:t>
-            </w:r>
-            <w:r>
-              <w:rPr>
-                <w:i/>
-                <w:sz w:val="14"/>
-              </w:rPr>
-              <w:t>decision</w:t>
-            </w:r>
-            <w:r>
-              <w:rPr>
-                <w:i/>
-                <w:spacing w:val="-2"/>
-                <w:sz w:val="14"/>
-              </w:rPr>
-              <w:t> </w:t>
-            </w:r>
-            <w:r>
-              <w:rPr>
-                <w:i/>
-                <w:sz w:val="14"/>
-              </w:rPr>
-              <w:t>shall</w:t>
-            </w:r>
-            <w:r>
-              <w:rPr>
-                <w:i/>
-                <w:spacing w:val="-4"/>
-                <w:sz w:val="14"/>
-              </w:rPr>
-              <w:t> </w:t>
-            </w:r>
-            <w:r>
-              <w:rPr>
-                <w:i/>
-                <w:sz w:val="14"/>
-              </w:rPr>
-              <w:t>be</w:t>
-            </w:r>
-            <w:r>
-              <w:rPr>
-                <w:i/>
-                <w:spacing w:val="-3"/>
-                <w:sz w:val="14"/>
-              </w:rPr>
-              <w:t> </w:t>
-            </w:r>
-            <w:r>
-              <w:rPr>
-                <w:i/>
-                <w:sz w:val="14"/>
-              </w:rPr>
-              <w:t>different</w:t>
-            </w:r>
-            <w:r>
-              <w:rPr>
-                <w:i/>
-                <w:spacing w:val="-3"/>
-                <w:sz w:val="14"/>
-              </w:rPr>
-              <w:t> </w:t>
-            </w:r>
-            <w:r>
-              <w:rPr>
-                <w:i/>
-                <w:sz w:val="14"/>
-              </w:rPr>
-              <w:t>from</w:t>
-            </w:r>
-            <w:r>
-              <w:rPr>
-                <w:i/>
-                <w:spacing w:val="-4"/>
-                <w:sz w:val="14"/>
-              </w:rPr>
-              <w:t> </w:t>
-            </w:r>
-            <w:r>
-              <w:rPr>
-                <w:i/>
-                <w:sz w:val="14"/>
-              </w:rPr>
-              <w:t>the</w:t>
-            </w:r>
-            <w:r>
-              <w:rPr>
-                <w:i/>
-                <w:spacing w:val="-3"/>
-                <w:sz w:val="14"/>
-              </w:rPr>
-              <w:t> </w:t>
-            </w:r>
-            <w:r>
-              <w:rPr>
-                <w:i/>
-                <w:sz w:val="14"/>
-              </w:rPr>
-              <w:t>person(s)</w:t>
-            </w:r>
-            <w:r>
-              <w:rPr>
-                <w:i/>
-                <w:spacing w:val="-2"/>
-                <w:sz w:val="14"/>
-              </w:rPr>
-              <w:t> </w:t>
-            </w:r>
-            <w:r>
-              <w:rPr>
-                <w:i/>
-                <w:sz w:val="14"/>
-              </w:rPr>
-              <w:t>who</w:t>
-            </w:r>
-            <w:r>
-              <w:rPr>
-                <w:i/>
-                <w:spacing w:val="-3"/>
-                <w:sz w:val="14"/>
-              </w:rPr>
-              <w:t> </w:t>
-            </w:r>
-            <w:r>
-              <w:rPr>
-                <w:i/>
-                <w:sz w:val="14"/>
-              </w:rPr>
-              <w:t>carried</w:t>
-            </w:r>
-            <w:r>
-              <w:rPr>
-                <w:i/>
-                <w:spacing w:val="-2"/>
-                <w:sz w:val="14"/>
-              </w:rPr>
-              <w:t> </w:t>
-            </w:r>
-            <w:r>
-              <w:rPr>
-                <w:i/>
-                <w:sz w:val="14"/>
-              </w:rPr>
-              <w:t>out</w:t>
-            </w:r>
-            <w:r>
-              <w:rPr>
-                <w:i/>
-                <w:spacing w:val="-2"/>
-                <w:sz w:val="14"/>
-              </w:rPr>
-              <w:t> </w:t>
-            </w:r>
-            <w:r>
-              <w:rPr>
-                <w:i/>
-                <w:sz w:val="14"/>
-              </w:rPr>
-              <w:t>the</w:t>
-            </w:r>
-            <w:r>
-              <w:rPr>
-                <w:i/>
-                <w:spacing w:val="-4"/>
-                <w:sz w:val="14"/>
-              </w:rPr>
-              <w:t> </w:t>
-            </w:r>
-            <w:r>
-              <w:rPr>
-                <w:i/>
-                <w:sz w:val="14"/>
-              </w:rPr>
-              <w:t>pre-transfer</w:t>
-            </w:r>
-            <w:r>
-              <w:rPr>
-                <w:i/>
-                <w:spacing w:val="-3"/>
-                <w:sz w:val="14"/>
-              </w:rPr>
-              <w:t> </w:t>
-            </w:r>
-            <w:r>
-              <w:rPr>
-                <w:i/>
-                <w:sz w:val="14"/>
-              </w:rPr>
-              <w:t>review</w:t>
-            </w:r>
-            <w:r>
-              <w:rPr>
-                <w:i/>
-                <w:spacing w:val="-2"/>
-                <w:sz w:val="14"/>
-              </w:rPr>
-              <w:t> </w:t>
-            </w:r>
-            <w:r>
-              <w:rPr>
-                <w:i/>
-                <w:sz w:val="14"/>
-              </w:rPr>
-              <w:t>(IAF</w:t>
-            </w:r>
-            <w:r>
-              <w:rPr>
-                <w:i/>
-                <w:spacing w:val="-4"/>
-                <w:sz w:val="14"/>
-              </w:rPr>
-              <w:t> </w:t>
-            </w:r>
-            <w:r>
-              <w:rPr>
-                <w:i/>
-                <w:sz w:val="14"/>
-              </w:rPr>
-              <w:t>MD</w:t>
-            </w:r>
-            <w:r>
-              <w:rPr>
-                <w:i/>
-                <w:spacing w:val="-3"/>
-                <w:sz w:val="14"/>
-              </w:rPr>
-              <w:t> </w:t>
-            </w:r>
-            <w:r>
-              <w:rPr>
-                <w:i/>
-                <w:sz w:val="14"/>
-              </w:rPr>
-              <w:t>2:2023,</w:t>
-            </w:r>
-            <w:r>
-              <w:rPr>
-                <w:i/>
-                <w:spacing w:val="-2"/>
-                <w:sz w:val="14"/>
-              </w:rPr>
-              <w:t> </w:t>
-            </w:r>
-            <w:r>
-              <w:rPr>
-                <w:i/>
-                <w:sz w:val="14"/>
-              </w:rPr>
-              <w:t>Cl.</w:t>
-            </w:r>
-            <w:r>
-              <w:rPr>
-                <w:i/>
-                <w:spacing w:val="-2"/>
-                <w:sz w:val="14"/>
-              </w:rPr>
-              <w:t> 2.3.3).</w:t>
             </w:r>
           </w:p>
         </w:tc>

</xml_diff>